<commit_message>
review-5 round executed: base scored on held-out split (0.086/0.342, n=200), judge ceiling on real narrator recordings (0.089/0.377, n=110), interpretation(4) contradiction removed, domain caveat, SV limits rewritten (synthetic-variability + slight-difference stance), Chen 2022 + Snyder 2018 references verified and added, r-alternation cited to Dolphyne, z-outside-a-y note, u-o listed as height substitution, caption 960-step + log-scale, UK spelling, em dashes restored
</commit_message>
<xml_diff>
--- a/04_report/Twi_TTS_Technical_Report_APA7_Verified.docx
+++ b/04_report/Twi_TTS_Technical_Report_APA7_Verified.docx
@@ -341,7 +341,7 @@
           <w:sz w:val="24"/>
           <w:szCs w:val="24"/>
         </w:rPr>
-        <w:t>All 143,383 rows were indexed without downloading the 23 GB of audio (streaming metadata scan). The scan surfaced overlapping recording generations: duration forensics across 460 multi-version texts showed 454 with bit-identical durations, identifying the .1461/.1861 suffixes as one narrator re-released and .2094 as a second narrator - a distinction naive de-duplication would have destroyed.</w:t>
+        <w:t>All 143,383 rows were indexed without downloading the 23 GB of audio (streaming metadata scan). The scan surfaced overlapping recording generations: duration forensics across 460 multi-version texts showed 454 with bit-identical durations, identifying the .1461/.1861 suffixes as one narrator re-released and .2094 as a second narrator—a distinction naive de-duplication would have destroyed.</w:t>
       </w:r>
     </w:p>
     <w:p>
@@ -367,7 +367,7 @@
           <w:sz w:val="24"/>
           <w:szCs w:val="24"/>
         </w:rPr>
-        <w:t>realized</w:t>
+        <w:t>realised</w:t>
       </w:r>
       <w:r>
         <w:rPr>
@@ -393,7 +393,7 @@
           <w:sz w:val="24"/>
           <w:szCs w:val="24"/>
         </w:rPr>
-        <w:t>Text normalisation (own contribution). The base model's vocabulary contains exactly 30 entries; the normalised corpus text uses 24 of them: the 20 alphabet letters a-y excluding c, j, q, v and x, the Akan vowels ɛ and ɔ, the apostrophe and the hyphen; no uppercase, digits or other punctuation occurs in the selected text. The space character occurs by construction between words; the remaining entries - the digits 2 and 3, an underscore, an accented 'a' and a second apostrophe variant - never occur in the text, and the unknown-letter ledger guards the boundary: c, j, q, v, x and z are replaced with a pause and surfaced to the user. The pipeline derives from that inventory: (1) chat-orthography restoration (3ti s3n → ɛti sɛn); (2) number expansion to spoken Asante Twi (2026 → mpem mmienu ne aduonu nsia); (3) punctuation folding; (4) NFC canonical composition followed by NFKD decomposition used only to strip tone marks (the corpus is untone-marked); (5) apostrophes preserved; (6) an unknown-letter ledger (c, j, q, v, x, z replaced by a pause and surfaced to the user). Defects found by adversarial testing and fixed with regression tests: a digits-as-punctuation ordering bug, a year-over-2000 deletion bug, a teens-table off-by-one. Unit tests lock the train/inference invariant (every output character in the vocab; the identical module is used at training and inference, checked by a notebook-equivalence test). Orthographic decisions were informed by published descriptions of Akan sounds and spelling (Dolphyne, 1988; Unified Akan Orthography, 1979); the specific normalisation rules and tests were implemented for this project, with tokenizer behaviour checked against the VITS documentation (Hugging Face, n.d.).</w:t>
+        <w:t>Text normalisation (own contribution). The base model's vocabulary contains exactly 30 entries; the normalised corpus text uses 24 of them: the 20 alphabet letters a-y excluding c, j, q, v and x, the Akan vowels ɛ and ɔ, the apostrophe and the hyphen; no uppercase, digits or other punctuation occurs in the selected text. The space character occurs by construction between words; the remaining entries—the digits 2 and 3, an underscore, an accented 'a' and a second apostrophe variant—never occur in the text, and the unknown-letter ledger guards the boundary: c, j, q, v, x and z are replaced with a pause and surfaced to the user (z falls outside the a-y range, which is why it is listed separately). The pipeline derives from that inventory: (1) chat-orthography restoration (3ti s3n → ɛti sɛn); (2) number expansion to spoken Asante Twi (2026 → mpem mmienu ne aduonu nsia); (3) punctuation folding; (4) NFC canonical composition followed by NFKD decomposition used only to strip tone marks (the corpus is untone-marked); (5) apostrophes preserved; (6) an unknown-letter ledger (c, j, q, v, x, z replaced by a pause and surfaced to the user). Defects found by adversarial testing and fixed with regression tests: a digits-as-punctuation ordering bug, a year-over-2000 deletion bug, a teens-table off-by-one. Unit tests lock the train/inference invariant (every output character in the vocab; the identical module is used at training and inference, checked by a notebook-equivalence test). Orthographic decisions were informed by published descriptions of Akan sounds and spelling (Dolphyne, 1988; Unified Akan Orthography, 1979); the specific normalisation rules and tests were implemented for this project, with tokenizer behaviour checked against the VITS documentation (Hugging Face, n.d.).</w:t>
       </w:r>
       <w:r>
         <w:rPr>
@@ -551,7 +551,7 @@
           <w:sz w:val="24"/>
           <w:szCs w:val="24"/>
         </w:rPr>
-        <w:t>run (text encoder and flow held fixed; LR 5e-5, 12 epochs = 4,776 steps; reported with its result in Section 3). Training harness: ylacombe/finetune-hf-vits (MIT); batch 16, cosine schedule, warmup 2%, Adam beta (0.8, 0.99), weight decay 0.01, loss weights mel 35 / disc 3 / KL 1.5 / duration 1 / fmaps 1 / gen 1, fp16, seed 456. The reusable training framework is maintained by Lacombe (n.d.). Full per-step training histories did not survive across the free-tier platform sessions; the published logging artifact covers this final window.</w:t>
+        <w:t>run (text encoder and flow held fixed; LR 5e-5, 12 epochs = 4,776 steps; reported with its result in Section 3). Training harness: ylacombe/finetune-hf-vits (MIT); batch 16, cosine schedule, warmup 2%, Adam beta (0.8, 0.99), weight decay 0.01, loss weights mel 35 / disc 3 / KL 1.5 / duration 1 / fmaps 1 / gen 1, fp16, seed 456. The reusable training framework is maintained by Lacombe (n.d.). Full per-step training histories did not survive across the free-tier platform sessions; the published logging artefact covers this final window.</w:t>
       </w:r>
     </w:p>
     <w:p>
@@ -652,7 +652,7 @@
           <w:sz w:val="24"/>
           <w:szCs w:val="24"/>
         </w:rPr>
-        <w:t>Figure 1. Final 1,000-step logging window of the gentle retrain (steps 7,000-7,960, as published with the checkpoint): the summed loss and the component losses (mel, KL, generator/discriminator, duration, feature-matching) plateau without late divergence; published as loss_curve.png alongside losses.csv with the checkpoint (Dickson, 2026c).</w:t>
+        <w:t>Figure 1. Final 960-step logging window of the gentle retrain (steps 7,000-7,960, y-axis log scale, as published with the checkpoint): the summed loss and the component losses (mel, KL, generator/discriminator, duration, feature-matching) plateau without late divergence; published as loss_curve.png alongside losses.csv with the checkpoint (Dickson, 2026c).</w:t>
       </w:r>
       <w:r>
         <w:rPr>
@@ -740,23 +740,8 @@
             <w:tcW w:w="3904" w:type="pct"/>
           </w:tcPr>
           <w:p>
-            <w:pPr>
-              <w:spacing w:line="276" w:lineRule="auto"/>
-              <w:jc w:val="both"/>
-              <w:rPr>
-                <w:rFonts w:cs="Times New Roman"/>
-                <w:sz w:val="24"/>
-                <w:szCs w:val="24"/>
-              </w:rPr>
-            </w:pPr>
             <w:r>
-              <w:rPr>
-                <w:rFonts w:cs="Times New Roman"/>
-                <w:b/>
-                <w:sz w:val="24"/>
-                <w:szCs w:val="24"/>
-              </w:rPr>
-              <w:t>Model (10 unseen prompts, seed 33, noise 0.667)</w:t>
+              <w:t>Model (10-prompt eval, seed 33, noise 0.667; last two rows: 200-clip held-out split)</w:t>
             </w:r>
           </w:p>
         </w:tc>
@@ -1119,6 +1104,38 @@
           </w:tcPr>
           <w:p>
             <w:r>
+              <w:t>Base model - held-out split (200 unseen real texts) - un-fine-tuned</w:t>
+            </w:r>
+          </w:p>
+        </w:tc>
+        <w:tc>
+          <w:tcPr>
+            <w:tcW w:type="dxa" w:w="1088"/>
+          </w:tcPr>
+          <w:p>
+            <w:r>
+              <w:t>0.086</w:t>
+            </w:r>
+          </w:p>
+        </w:tc>
+        <w:tc>
+          <w:tcPr>
+            <w:tcW w:type="dxa" w:w="1137"/>
+          </w:tcPr>
+          <w:p>
+            <w:r>
+              <w:t>0.342</w:t>
+            </w:r>
+          </w:p>
+        </w:tc>
+      </w:tr>
+      <w:tr>
+        <w:tc>
+          <w:tcPr>
+            <w:tcW w:type="dxa" w:w="7927"/>
+          </w:tcPr>
+          <w:p>
+            <w:r>
               <w:t>Gentle retrain - held-out split (200 unseen real texts) - SUBMITTED</w:t>
             </w:r>
           </w:p>
@@ -1201,7 +1218,7 @@
           <w:sz w:val="24"/>
           <w:szCs w:val="24"/>
         </w:rPr>
-        <w:t>Noise-setting comparison (same engine, seed 33): at noise 1.0 the models score base 0.122 CER / 0.418 WER, original 0.388 / 0.781, gentle 0.320 / 0.739 - higher noise did not mitigate the regression for any model, so the stored 0.667 is used for all headline rows. The Oct-9 T4-measured values were recorded at the noise-1.0 setting on GPU (base 0.107 / original 0.424 / gentle 0.315) and differ from the CPU re-measurement at the same setting by up to 0.04 CER; this engine/platform difference is carried as a measurement limitation and changes no ranking. The reserved 200-clip evaluation split (Section 2), isolated before training subsampling and never used in training, was synthesized with the submitted gentle model and scored with the same engine, seed and mismatch controls: CER 0.240 / WER 0.672, mismatch control 0.997 - the 10-prompt estimate (0.228) is replicated on held-out material rather than replaced.</w:t>
+        <w:t>Noise-setting comparison (same engine, seed 33): at noise 1.0 the models score base 0.122 CER / 0.418 WER, original 0.388 / 0.781, gentle 0.320 / 0.739 - higher noise did not mitigate the regression for any model, so the stored 0.667 is used for all headline rows. The Oct-9 T4-measured values were recorded at the noise-1.0 setting on GPU (base 0.107 / original 0.424 / gentle 0.315) and differ from the CPU re-measurement at the same setting by up to 0.04 CER; this engine/platform difference is carried as a measurement limitation and changes no ranking. The reserved 200-clip evaluation split (Section 2), isolated before training subsampling and never used in training, was synthesised with the submitted gentle model and scored with the same engine, seed and mismatch controls: CER 0.240 / WER 0.672, mismatch control 0.997. The agreement with the 10-prompt estimate (0.228) should not be read as a straightforward replication: the split draws on in-domain Bible text while the 10 prompts are everyday sentences, so similar scores across different text domains are informative rather than replicating. The judge ceiling on the same split: the same engine and controls score the 110 real narrator reference recordings at CER 0.089 / WER 0.377 (mismatch control 0.906), so the submitted model's held-out 0.240 sits about 0.15 CER above what the judge achieves on natural human speech on the same material - the judge, not the model, is near the floor here. The base model on the same reserved split: CER 0.086 / WER 0.342 (mismatch control 0.999) over all 200 clips - consistent with its 10-prompt row (0.080 / 0.305) and within the judge ceiling measured on the real recordings (0.089). The submitted model therefore remains behind the base checkpoint on held-out material (0.240 vs 0.086), matching the 10-prompt finding.</w:t>
       </w:r>
       <w:r>
         <w:rPr>
@@ -1234,7 +1251,7 @@
           <w:sz w:val="24"/>
           <w:szCs w:val="24"/>
         </w:rPr>
-        <w:t>Interpretation. (1) On this judge both fine-tunes sit above the base model; the gentle retrain recovered 38% of the gap (CER 0.319 to 0.228; WER 0.730 to 0.635; the T4-measured Oct-9 rows, at their noise-1.0 setting, give 34%) and the original run is retained unmodified as the documented ablation. (2) The judge descends from the same Meta MMS family as the base model and may favour base-model phonetics; that bias is not ruled out  -  the blinded listener panel (Section 4) is the designed check. (3) Every published number carries the mismatched-prompt control (CPU re-measure 0.85-0.90; T4-era 0.92-1.04: paired text scores far better than mismatched text, so the ranking is informative). Per-clip transcripts and scores ship as machine-readable asr_eval files next to the checkpoints and in the shared folder. (4) The ranking rests on 10 prompts: at this count the gentle and freeze runs are effectively tied on WER (0.635 vs 0.634), the submission choice between the two fine-tunes rests on CER (0.228 vs 0.263), and no finer separation is claimed; the reserved 200-clip split was not scored for this report, and extending the ranking to it is the first planned re-measurement.</w:t>
+        <w:t>Interpretation. (1) On this judge both fine-tunes sit above the base model; the gentle retrain recovered 38% of the gap (CER 0.319 to 0.228; WER 0.730 to 0.635; the T4-measured Oct-9 rows, at their noise-1.0 setting, give 34%) and the original run is retained unmodified as the documented ablation. (2) The judge descends from the same Meta MMS family as the base model and may favour base-model phonetics; that bias is not ruled out—the blinded listener panel (Section 4) is the designed check. (3) Every published number carries the mismatched-prompt control (CPU re-measure 0.85-0.90; T4-era 0.92-1.04: paired text scores far better than mismatched text, so the ranking is informative). Per-clip transcripts and scores ship as machine-readable asr_eval files next to the checkpoints and in the shared folder. (4) The ranking rests on 10 prompts: at this count the gentle and freeze runs are effectively tied on WER (0.635 vs 0.634), the submission choice between the two fine-tunes rests on CER (0.228 vs 0.263), and no finer separation is claimed; the reserved 200-clip result (CER 0.240 for the submitted model) confirms this 10-prompt estimate on the held-out split (Table 1).</w:t>
       </w:r>
     </w:p>
     <w:p>
@@ -1309,7 +1326,7 @@
           <w:sz w:val="24"/>
           <w:szCs w:val="24"/>
         </w:rPr>
-        <w:t>Akan has lexical and grammatical tone (Dolphyne, 1988), but the selected corpus orthography is unmarked, so prosody is acquired implicitly from one narrator's reading style  -  tonally consistent, not tone-controlled; minimal-tone-pair rendering cannot be guaranteed. Identified remedies: a tone-aware G2P (Grapheme-to-Phoneme) front-end or tone-marked fine-tuning data.</w:t>
+        <w:t>Akan has lexical and grammatical tone (Dolphyne, 1988), but the selected corpus orthography is unmarked, so prosody is acquired implicitly from one narrator's reading style—tonally consistent, not tone-controlled; minimal-tone-pair rendering cannot be guaranteed. Identified remedies: a tone-aware G2P (Grapheme-to-Phoneme) front-end or tone-marked fine-tuning data.</w:t>
       </w:r>
     </w:p>
     <w:p>
@@ -1372,7 +1389,7 @@
           <w:sz w:val="24"/>
           <w:szCs w:val="24"/>
         </w:rPr>
-        <w:t>Why the fine-tuned model is submitted despite the higher judge error. On the ASR judge neither fine-tune out-performs the base checkpoint, and no such claim is made: the submitted model demonstrates the completed training the brief required, with the base retained as its reference row (Section 3), and the base model remains the more intelligible system on this judge. On that judge, 9.09 h of one narrator, at the learning rates tested, degraded the multilingual prior pronunciation rather than improving it. Speaker identity, measured separately with a speaker-verification model (WavLM x-vector embeddings), tells a different story: cosine to the narrator centroid (110 real corpus clips) scores - base 0.915 +/- 0.021, original 0.940 +/- 0.018, submitted 0.940 +/- 0.025 (10 unseen prompts each), against a different-speaker control of 0.817 and a leave-one-out same-speaker ceiling of 0.924 +/- 0.077. The base voice is therefore already close to the narrator in this space, and fine-tuning moved the synthesized speakers slightly toward the narrator centroid with a tighter spread. Three limits apply: the ceiling estimate is itself noisy (its spread reflects short, variable-length real clips); timbre similarity measures speaker identity only, not pronunciation or naturalness - which remain the listener panel's task; and until its ratings exist, no perceptual-improvement claim is made.</w:t>
+        <w:t>Why the fine-tuned model is submitted despite the higher judge error. On the ASR judge neither fine-tune out-performs the base checkpoint, and no such claim is made: the submitted model demonstrates the completed training the brief required, with the base retained as its reference row (Section 3), and the base model remains the more intelligible system on this judge. On that judge, 9.09 h of one narrator, at the learning rates tested, degraded the multilingual prior pronunciation rather than improving it. Speaker identity, measured separately with a speaker-verification model (WavLM x-vector embeddings: Chen et al., 2022; Snyder et al., 2018; checkpoint microsoft/wavlm-base-plus-sv), tells a different story: cosine to the narrator centroid (110 real corpus clips) scores—base 0.915 +/- 0.021, original 0.940 +/- 0.018, submitted 0.940 +/- 0.025 (10 unseen prompts each), against a different-speaker control of 0.817 and a leave-one-out same-speaker ceiling of 0.924 +/- 0.077. The base voice is therefore already close to the narrator in this space, and fine-tuning moved the synthesised speakers slightly toward the narrator centroid with a tighter spread. Three limits apply. First, synthetic speech is less variable than real recordings: short real clips vary in register, loudness and prosody, so the narrator's own leave-one-out spread is the noisier estimate, and system means can sit at or above it without indicating identity beyond it. Second, timbre similarity measures speaker identity only, not pronunciation or naturalness—which remain the listener panel's task. Third, the base-to-submitted difference (0.915 vs 0.940, n = 10) is small relative to per-clip spread, so it is described as slight rather than claimed as a speaker-identity gain. Until listener ratings exist, no perceptual-improvement claim is made.</w:t>
       </w:r>
       <w:r>
         <w:rPr>
@@ -1405,7 +1422,7 @@
           <w:sz w:val="24"/>
           <w:szCs w:val="24"/>
         </w:rPr>
-        <w:t>Training used the selected professional single-voice Bible narration resource (GhanaNLP Community, 2026); everyday-domain synthesis shows measured prosody flattening and judge-observed vowel substitutions: no systematic errors on the written ɛ or ɔ were observed across the 10 prompts (ɔ renders intact in most prompts, e.g. mpɔtam→pɔtam), while the judge's transcriptions concentrate substitutions o→ɔ in short words (ho→hɔ; ɛno→ɛnɔ) and u→o (sukuu→sokuu); one prompt shows the intervocalic r rendered inconsistently (ɔkraman→ɔkaaman, a documented Akan r-variation rather than a vowel error). As transcription output confounds synthesis error with the judge's own transcription variability, these observations are offered as a hypothesis consistent with ATR-ambiguous back-vowel contexts (Section 1), not as a verified acoustic finding; targeted auditory verification is future work. One earlier-generation output rendered nea as niɛ (e→i, a→ɛ). Clips under ~2 s show metallic artefacts (excluded by the duration window); occasional breath insertions remain from the reading register.</w:t>
+        <w:t>Training used the selected professional single-voice Bible narration resource (GhanaNLP Community, 2026); everyday-domain synthesis shows measured prosody flattening and judge-observed vowel substitutions: no systematic errors on the written ɛ or ɔ were observed across the 10 prompts (ɔ renders intact in most prompts, e.g. mpɔtam→pɔtam), while the judge's transcriptions concentrate o→ɔ in short words (ho→hɔ; ɛno→ɛnɔ); a separate substitution, u→o (sukuu→sokuu), differs in vowel height rather than ATR setting; one prompt shows the intervocalic r rendered inconsistently (ɔkraman→ɔkaaman, an intervocalic r alternation documented in Akan phonology (Dolphyne, 1988) rather than a vowel error). As transcription output confounds synthesis error with the judge's own transcription variability, these observations are offered as a hypothesis consistent with ATR-ambiguous back-vowel contexts (Section 1), not as a verified acoustic finding; targeted auditory verification is future work. One earlier-generation output rendered nea as niɛ (e→i, a→ɛ). Clips under ~2 s show metallic artefacts (excluded by the duration window); occasional breath insertions remain from the reading register.</w:t>
       </w:r>
     </w:p>
     <w:p>
@@ -1538,6 +1555,59 @@
           <w:szCs w:val="24"/>
         </w:rPr>
         <w:t>References</w:t>
+      </w:r>
+    </w:p>
+    <w:p>
+      <w:pPr>
+        <w:spacing w:after="80"/>
+        <w:ind w:left="403" w:hanging="403"/>
+        <w:jc w:val="both"/>
+        <w:rPr>
+          <w:rFonts w:cs="Times New Roman"/>
+          <w:sz w:val="24"/>
+          <w:szCs w:val="24"/>
+        </w:rPr>
+      </w:pPr>
+      <w:r>
+        <w:rPr>
+          <w:rFonts w:cs="Times New Roman"/>
+          <w:sz w:val="24"/>
+          <w:szCs w:val="24"/>
+        </w:rPr>
+        <w:t>Chen, S., Wang, C., Chen, Z., Wu, Y., Liu, S., Chen, Z., Li, J., Kanda, N., Yoshioka, T., Xiao, X., Wu, J., Zhou, L., Ren, S., Qian, Y., Qian, Y., Wu, J., Zeng, M., Yu, X., &amp; Wei, F. (2022). WavLM: Large-scale self-supervised pre-training for full stack speech processing. IEEE Journal of Selected Topics in Signal Processing, 16(6), 1505-1518. https://doi.org/10.1109/JSTSP.2022.3188113</w:t>
+      </w:r>
+      <w:r>
+        <w:rPr>
+          <w:rFonts w:cs="Times New Roman"/>
+          <w:i/>
+          <w:sz w:val="24"/>
+          <w:szCs w:val="24"/>
+        </w:rPr>
+      </w:r>
+      <w:r>
+        <w:rPr>
+          <w:rFonts w:cs="Times New Roman"/>
+          <w:sz w:val="24"/>
+          <w:szCs w:val="24"/>
+        </w:rPr>
+      </w:r>
+      <w:hyperlink r:id="rId10" w:history="1">
+        <w:r>
+          <w:rPr>
+            <w:rStyle w:val="Hyperlink"/>
+            <w:rFonts w:cs="Times New Roman"/>
+            <w:sz w:val="24"/>
+            <w:szCs w:val="24"/>
+          </w:rPr>
+          <w:t>https://github.com/Dickson32-cell/akan-tts-asante</w:t>
+        </w:r>
+      </w:hyperlink>
+      <w:r>
+        <w:rPr>
+          <w:rFonts w:cs="Times New Roman"/>
+          <w:sz w:val="24"/>
+          <w:szCs w:val="24"/>
+        </w:rPr>
       </w:r>
     </w:p>
     <w:p>
@@ -2402,6 +2472,52 @@
           <w:szCs w:val="24"/>
         </w:rPr>
         <w:t xml:space="preserve"> </w:t>
+      </w:r>
+    </w:p>
+    <w:p>
+      <w:pPr>
+        <w:spacing w:after="80"/>
+        <w:ind w:left="403" w:hanging="403"/>
+        <w:jc w:val="both"/>
+        <w:rPr>
+          <w:rFonts w:cs="Times New Roman"/>
+          <w:sz w:val="24"/>
+          <w:szCs w:val="24"/>
+        </w:rPr>
+      </w:pPr>
+      <w:r>
+        <w:rPr>
+          <w:rFonts w:cs="Times New Roman"/>
+          <w:i/>
+          <w:sz w:val="24"/>
+          <w:szCs w:val="24"/>
+        </w:rPr>
+        <w:t>Snyder, D., Garcia-Romero, D., Sell, G., Povey, D., &amp; Khudanpur, S. (2018). X-vectors: Robust DNN embeddings for speaker recognition. 2018 IEEE International Conference on Acoustics, Speech and Signal Processing (ICASSP), 5329-5333. https://doi.org/10.1109/ICASSP.2018.8461375</w:t>
+      </w:r>
+      <w:r>
+        <w:rPr>
+          <w:rFonts w:cs="Times New Roman"/>
+          <w:sz w:val="24"/>
+          <w:szCs w:val="24"/>
+        </w:rPr>
+      </w:r>
+      <w:hyperlink r:id="rId24" w:history="1">
+        <w:r>
+          <w:rPr>
+            <w:rStyle w:val="Hyperlink"/>
+            <w:rFonts w:cs="Times New Roman"/>
+            <w:sz w:val="24"/>
+            <w:szCs w:val="24"/>
+          </w:rPr>
+          <w:t>https://glottolog.org/resource/reference/id/139493</w:t>
+        </w:r>
+      </w:hyperlink>
+      <w:r>
+        <w:rPr>
+          <w:rFonts w:cs="Times New Roman"/>
+          <w:sz w:val="24"/>
+          <w:szCs w:val="24"/>
+        </w:rPr>
       </w:r>
     </w:p>
     <w:p>

</xml_diff>

<commit_message>
review-6 round: glued hyperlinks stripped from Chen/Snyder refs (en dashes 1505-1518, 5329-5333), judge reference-floor passage rewritten (base 0.086 at floor vs submitted 0.240, subset n=110 stated, same-family bias tied to point 2), replication-vs-confirm wording aligned, table subheading row + en dash labels, optimiser, remaining spaced hyphens converted
</commit_message>
<xml_diff>
--- a/04_report/Twi_TTS_Technical_Report_APA7_Verified.docx
+++ b/04_report/Twi_TTS_Technical_Report_APA7_Verified.docx
@@ -519,7 +519,7 @@
           <w:sz w:val="24"/>
           <w:szCs w:val="24"/>
         </w:rPr>
-        <w:t xml:space="preserve">Three fine-tuning runs share identical data, loss weights and seed discipline: the original fine-tune (LR 2e-4, 30 epochs = 11,940 optimizer steps; 4.07 h on a free-tier Colab T4), the </w:t>
+        <w:t xml:space="preserve">Three fine-tuning runs share identical data, loss weights and seed discipline: the original fine-tune (LR 2e-4, 30 epochs = 11,940 optimiser steps; 4.07 h on a free-tier Colab T4), the </w:t>
       </w:r>
       <w:r>
         <w:rPr>
@@ -741,7 +741,7 @@
           </w:tcPr>
           <w:p>
             <w:r>
-              <w:t>Model (10-prompt eval, seed 33, noise 0.667; last two rows: 200-clip held-out split)</w:t>
+              <w:t>Model (10 unseen prompts, seed 33, noise 0.667)</w:t>
             </w:r>
           </w:p>
         </w:tc>
@@ -819,7 +819,7 @@
                 <w:szCs w:val="24"/>
                 <w:lang w:val="it-IT"/>
               </w:rPr>
-              <w:t>Base model (facebook/mms-tts-aka) - un-fine-tuned</w:t>
+              <w:t>Base model (facebook/mms-tts-aka) – un-fine-tuned</w:t>
             </w:r>
           </w:p>
         </w:tc>
@@ -893,7 +893,7 @@
                 <w:sz w:val="24"/>
                 <w:szCs w:val="24"/>
               </w:rPr>
-              <w:t>Original fine-tune (11,940 steps) - ablation</w:t>
+              <w:t>Original fine-tune (11,940 steps) – ablation</w:t>
             </w:r>
           </w:p>
         </w:tc>
@@ -968,7 +968,7 @@
                 <w:sz w:val="24"/>
                 <w:szCs w:val="24"/>
               </w:rPr>
-              <w:t>Gentle retrain (7,960 steps) - SUBMITTED</w:t>
+              <w:t>Gentle retrain (7,960 steps) – SUBMITTED</w:t>
             </w:r>
           </w:p>
         </w:tc>
@@ -1100,11 +1100,27 @@
       <w:tr>
         <w:tc>
           <w:tcPr>
+            <w:tcW w:type="dxa" w:w="10152"/>
+            <w:gridSpan w:val="3"/>
+          </w:tcPr>
+          <w:p>
+            <w:r>
+              <w:rPr>
+                <w:b/>
+              </w:rPr>
+              <w:t>Held-out split, 200 clips</w:t>
+            </w:r>
+          </w:p>
+        </w:tc>
+      </w:tr>
+      <w:tr>
+        <w:tc>
+          <w:tcPr>
             <w:tcW w:type="dxa" w:w="7927"/>
           </w:tcPr>
           <w:p>
             <w:r>
-              <w:t>Base model - held-out split (200 unseen real texts) - un-fine-tuned</w:t>
+              <w:t>Base model – held-out split (200 unseen real texts) – un-fine-tuned</w:t>
             </w:r>
           </w:p>
         </w:tc>
@@ -1136,7 +1152,7 @@
           </w:tcPr>
           <w:p>
             <w:r>
-              <w:t>Gentle retrain - held-out split (200 unseen real texts) - SUBMITTED</w:t>
+              <w:t>Gentle retrain – held-out split (200 unseen real texts) – SUBMITTED</w:t>
             </w:r>
           </w:p>
         </w:tc>
@@ -1189,16 +1205,14 @@
           <w:sz w:val="24"/>
           <w:szCs w:val="24"/>
         </w:rPr>
-        <w:t xml:space="preserve">Results (re-measured 13 Oct 2026 on the repository's own engine: python src/eval_asr.py --engine mms_aka; mismatched-prompt controls 0.85-0.90): on the 10 unseen prompts at the stored noise </w:t>
-      </w:r>
-      <w:r>
-        <w:rPr>
-          <w:rFonts w:cs="Times New Roman"/>
-          <w:sz w:val="24"/>
-          <w:szCs w:val="24"/>
-        </w:rPr>
-        <w:lastRenderedPageBreak/>
-        <w:t>setting 0.667, seed 33 - base 0.080 CER / 0.305 WER; original fine-tune 0.319 / 0.730; submitted gentle retrain 0.228 / 0.635. These are project-reported measurements rather than independently reproduced external benchmark scores. Reference audio exists for the reserved evaluation split, but no spectral-distance metrics were reported within the submission window: no aligned mel-cepstral or F0-error pipeline was established and no judge ceiling on the reference recordings was computed; the ASR round-trip with its mismatched-prompt control serves as the objective layer.</w:t>
+        <w:t>Results (re-measured 13 Oct 2026 on the repository's own engine: python src/eval_asr.py --engine mms_aka; mismatched-prompt controls 0.85-0.90): on the 10 unseen prompts at the stored noise setting 0.667, seed 33—base 0.080 CER / 0.305 WER; original fine-tune 0.319 / 0.730; submitted gentle retrain 0.228 / 0.635. These are project-reported measurements rather than independently reproduced external benchmark scores. Reference audio exists for the reserved evaluation split, but no spectral-distance metrics were reported within the submission window: no aligned mel-cepstral or F0-error pipeline was established; a judge reference floor was measured on the first 110 reserved references (see below), where the ASR round-trip with its mismatched-prompt control serves as the objective layer.</w:t>
+      </w:r>
+      <w:r>
+        <w:rPr>
+          <w:rFonts w:cs="Times New Roman"/>
+          <w:sz w:val="24"/>
+          <w:szCs w:val="24"/>
+        </w:rPr>
       </w:r>
     </w:p>
     <w:p>
@@ -1218,7 +1232,7 @@
           <w:sz w:val="24"/>
           <w:szCs w:val="24"/>
         </w:rPr>
-        <w:t>Noise-setting comparison (same engine, seed 33): at noise 1.0 the models score base 0.122 CER / 0.418 WER, original 0.388 / 0.781, gentle 0.320 / 0.739 - higher noise did not mitigate the regression for any model, so the stored 0.667 is used for all headline rows. The Oct-9 T4-measured values were recorded at the noise-1.0 setting on GPU (base 0.107 / original 0.424 / gentle 0.315) and differ from the CPU re-measurement at the same setting by up to 0.04 CER; this engine/platform difference is carried as a measurement limitation and changes no ranking. The reserved 200-clip evaluation split (Section 2), isolated before training subsampling and never used in training, was synthesised with the submitted gentle model and scored with the same engine, seed and mismatch controls: CER 0.240 / WER 0.672, mismatch control 0.997. The agreement with the 10-prompt estimate (0.228) should not be read as a straightforward replication: the split draws on in-domain Bible text while the 10 prompts are everyday sentences, so similar scores across different text domains are informative rather than replicating. The judge ceiling on the same split: the same engine and controls score the 110 real narrator reference recordings at CER 0.089 / WER 0.377 (mismatch control 0.906), so the submitted model's held-out 0.240 sits about 0.15 CER above what the judge achieves on natural human speech on the same material - the judge, not the model, is near the floor here. The base model on the same reserved split: CER 0.086 / WER 0.342 (mismatch control 0.999) over all 200 clips - consistent with its 10-prompt row (0.080 / 0.305) and within the judge ceiling measured on the real recordings (0.089). The submitted model therefore remains behind the base checkpoint on held-out material (0.240 vs 0.086), matching the 10-prompt finding.</w:t>
+        <w:t>Noise-setting comparison (same engine, seed 33): at noise 1.0 the models score base 0.122 CER / 0.418 WER, original 0.388 / 0.781, gentle 0.320 / 0.739—higher noise did not mitigate the regression for any model, so the stored 0.667 is used for all headline rows. The Oct-9 T4-measured values were recorded at the noise-1.0 setting on GPU (base 0.107 / original 0.424 / gentle 0.315) and differ from the CPU re-measurement at the same setting by up to 0.04 CER; this engine/platform difference is carried as a measurement limitation and changes no ranking. The reserved 200-clip evaluation split (Section 2), isolated before training subsampling and never used in training, was synthesised with the submitted gentle model and scored with the same engine, seed and mismatch controls: CER 0.240 / WER 0.672, mismatch control 0.997. The agreement with the 10-prompt estimate (0.228) deserves caution: the held-out split draws on in-domain Bible text while the 10 prompts are everyday sentences, so similar scores across the two text domains strengthen the estimate but are not a replication. On the same split, the judge scores the real narrator recordings at CER 0.089 / WER 0.377 (mismatch control 0.906), which serves as a reference floor for natural speech; the floor covers the first 110 reserved references, where network collection stopped, so it is a subset of the 200-clip split rather than the full set. The base model reaches this floor (0.086 over all 200 clips), while the submitted model sits about 0.15 above it (0.240). That the judge rates the base synthesis as highly as the human narrator is consistent with the same-family bias flagged in point (2), and suggests the ASR judge partly measures closeness to MMS output rather than intelligibility alone. The submitted model therefore remains behind the base checkpoint on held-out material (0.240 vs 0.086), matching the 10-prompt finding.</w:t>
       </w:r>
       <w:r>
         <w:rPr>
@@ -1251,7 +1265,7 @@
           <w:sz w:val="24"/>
           <w:szCs w:val="24"/>
         </w:rPr>
-        <w:t>Interpretation. (1) On this judge both fine-tunes sit above the base model; the gentle retrain recovered 38% of the gap (CER 0.319 to 0.228; WER 0.730 to 0.635; the T4-measured Oct-9 rows, at their noise-1.0 setting, give 34%) and the original run is retained unmodified as the documented ablation. (2) The judge descends from the same Meta MMS family as the base model and may favour base-model phonetics; that bias is not ruled out—the blinded listener panel (Section 4) is the designed check. (3) Every published number carries the mismatched-prompt control (CPU re-measure 0.85-0.90; T4-era 0.92-1.04: paired text scores far better than mismatched text, so the ranking is informative). Per-clip transcripts and scores ship as machine-readable asr_eval files next to the checkpoints and in the shared folder. (4) The ranking rests on 10 prompts: at this count the gentle and freeze runs are effectively tied on WER (0.635 vs 0.634), the submission choice between the two fine-tunes rests on CER (0.228 vs 0.263), and no finer separation is claimed; the reserved 200-clip result (CER 0.240 for the submitted model) confirms this 10-prompt estimate on the held-out split (Table 1).</w:t>
+        <w:t>Interpretation. (1) On this judge both fine-tunes sit above the base model; the gentle retrain recovered 38% of the gap (CER 0.319 to 0.228; WER 0.730 to 0.635; the T4-measured Oct-9 rows, at their noise-1.0 setting, give 34%) and the original run is retained unmodified as the documented ablation. (2) The judge descends from the same Meta MMS family as the base model and may favour base-model phonetics; that bias is not ruled out—the blinded listener panel (Section 4) is the designed check. (3) Every published number carries the mismatched-prompt control (CPU re-measure 0.85-0.90; T4-era 0.92-1.04: paired text scores far better than mismatched text, so the ranking is informative). Per-clip transcripts and scores ship as machine-readable asr_eval files next to the checkpoints and in the shared folder. (4) The ranking rests on 10 prompts: at this count the gentle and freeze runs are effectively tied on WER (0.635 vs 0.634), the submission choice between the two fine-tunes rests on CER (0.228 vs 0.263), and no finer separation is claimed; the reserved 200-clip result (CER 0.240) is consistent with the 10-prompt estimate (Table 1).</w:t>
       </w:r>
     </w:p>
     <w:p>
@@ -1574,7 +1588,7 @@
           <w:sz w:val="24"/>
           <w:szCs w:val="24"/>
         </w:rPr>
-        <w:t>Chen, S., Wang, C., Chen, Z., Wu, Y., Liu, S., Chen, Z., Li, J., Kanda, N., Yoshioka, T., Xiao, X., Wu, J., Zhou, L., Ren, S., Qian, Y., Qian, Y., Wu, J., Zeng, M., Yu, X., &amp; Wei, F. (2022). WavLM: Large-scale self-supervised pre-training for full stack speech processing. IEEE Journal of Selected Topics in Signal Processing, 16(6), 1505-1518. https://doi.org/10.1109/JSTSP.2022.3188113</w:t>
+        <w:t>Chen, S., Wang, C., Chen, Z., Wu, Y., Liu, S., Chen, Z., Li, J., Kanda, N., Yoshioka, T., Xiao, X., Wu, J., Zhou, L., Ren, S., Qian, Y., Qian, Y., Wu, J., Zeng, M., Yu, X., &amp; Wei, F. (2022). WavLM: Large-scale self-supervised pre-training for full stack speech processing. IEEE Journal of Selected Topics in Signal Processing, 16(6), 1505–1518. https://doi.org/10.1109/JSTSP.2022.3188113</w:t>
       </w:r>
       <w:r>
         <w:rPr>
@@ -1591,17 +1605,6 @@
           <w:szCs w:val="24"/>
         </w:rPr>
       </w:r>
-      <w:hyperlink r:id="rId10" w:history="1">
-        <w:r>
-          <w:rPr>
-            <w:rStyle w:val="Hyperlink"/>
-            <w:rFonts w:cs="Times New Roman"/>
-            <w:sz w:val="24"/>
-            <w:szCs w:val="24"/>
-          </w:rPr>
-          <w:t>https://github.com/Dickson32-cell/akan-tts-asante</w:t>
-        </w:r>
-      </w:hyperlink>
       <w:r>
         <w:rPr>
           <w:rFonts w:cs="Times New Roman"/>
@@ -2492,26 +2495,15 @@
           <w:sz w:val="24"/>
           <w:szCs w:val="24"/>
         </w:rPr>
-        <w:t>Snyder, D., Garcia-Romero, D., Sell, G., Povey, D., &amp; Khudanpur, S. (2018). X-vectors: Robust DNN embeddings for speaker recognition. 2018 IEEE International Conference on Acoustics, Speech and Signal Processing (ICASSP), 5329-5333. https://doi.org/10.1109/ICASSP.2018.8461375</w:t>
-      </w:r>
-      <w:r>
-        <w:rPr>
-          <w:rFonts w:cs="Times New Roman"/>
-          <w:sz w:val="24"/>
-          <w:szCs w:val="24"/>
-        </w:rPr>
-      </w:r>
-      <w:hyperlink r:id="rId24" w:history="1">
-        <w:r>
-          <w:rPr>
-            <w:rStyle w:val="Hyperlink"/>
-            <w:rFonts w:cs="Times New Roman"/>
-            <w:sz w:val="24"/>
-            <w:szCs w:val="24"/>
-          </w:rPr>
-          <w:t>https://glottolog.org/resource/reference/id/139493</w:t>
-        </w:r>
-      </w:hyperlink>
+        <w:t>Snyder, D., Garcia-Romero, D., Sell, G., Povey, D., &amp; Khudanpur, S. (2018). X-vectors: Robust DNN embeddings for speaker recognition. 2018 IEEE International Conference on Acoustics, Speech and Signal Processing (ICASSP), 5329–5333. https://doi.org/10.1109/ICASSP.2018.8461375</w:t>
+      </w:r>
+      <w:r>
+        <w:rPr>
+          <w:rFonts w:cs="Times New Roman"/>
+          <w:sz w:val="24"/>
+          <w:szCs w:val="24"/>
+        </w:rPr>
+      </w:r>
       <w:r>
         <w:rPr>
           <w:rFonts w:cs="Times New Roman"/>

</xml_diff>